<commit_message>
v1.4.0 BETA — Spotify search with tabbed interface, Queue and Play Now actions
Add Spotify catalog search to the left panel via a new tabbed interface
(Playlists | Search) below the Now Playing section. Search results show
Queue and Play Now buttons matching the announcement panel styling.

- searchTracks() in spotify-api.ts calls GET /v1/search?type=track
- Queue button adds track to Spotify queue (or plays directly if cold start)
- Play Now button uses fade-queue-skip pattern to preserve playlist context
- Queued search tracks appear in Up Next with the same orange queue box as
  announcements (mutually exclusive — most recent replaces the former)
- TrackRow component shared between queue and search with hover-brand styling
- Logo fix: added sizes and unoptimized props for Next.js 16 Turbopack
- Comprehensive code comments throughout all changed files
- Updated NSBP-Radio-Technical-Documentation.docx

Co-Authored-By: Claude Opus 4.6 (1M context) <noreply@anthropic.com>
</commit_message>
<xml_diff>
--- a/NSBP-Radio-Technical-Documentation.docx
+++ b/NSBP-Radio-Technical-Documentation.docx
@@ -68,7 +68,7 @@
           <w:sz w:val="22"/>
           <w:szCs w:val="22"/>
         </w:rPr>
-        <w:t xml:space="preserve">Version 1.2.0 BETA · 2025</w:t>
+        <w:t xml:space="preserve">Version 1.4.0 BETA · 2025</w:t>
       </w:r>
     </w:p>
     <w:p>
@@ -76,7 +76,7 @@
         <w:spacing w:after="400"/>
         <w:jc w:val="center"/>
       </w:pPr>
-      <w:hyperlink w:history="1" r:id="rIdza8vuxz-ltxejcvevz9pv">
+      <w:hyperlink w:history="1" r:id="rIdtvgv-kk5jm-sordmxci1h">
         <w:r>
           <w:rPr>
             <w:rFonts w:ascii="Arial" w:cs="Arial" w:eastAsia="Arial" w:hAnsi="Arial"/>
@@ -383,6 +383,42 @@
           <w:szCs w:val="22"/>
         </w:rPr>
         <w:t xml:space="preserve">Settings modal with announcement volume control (50–200%)</w:t>
+      </w:r>
+    </w:p>
+    <w:p>
+      <w:pPr>
+        <w:pStyle w:val="ListParagraph"/>
+        <w:numPr>
+          <w:ilvl w:val="0"/>
+          <w:numId w:val="2"/>
+        </w:numPr>
+        <w:spacing w:after="60"/>
+      </w:pPr>
+      <w:r>
+        <w:rPr>
+          <w:rFonts w:ascii="Arial" w:cs="Arial" w:eastAsia="Arial" w:hAnsi="Arial"/>
+          <w:sz w:val="22"/>
+          <w:szCs w:val="22"/>
+        </w:rPr>
+        <w:t xml:space="preserve">Spotify search — search the Spotify catalog and queue or play tracks directly</w:t>
+      </w:r>
+    </w:p>
+    <w:p>
+      <w:pPr>
+        <w:pStyle w:val="ListParagraph"/>
+        <w:numPr>
+          <w:ilvl w:val="0"/>
+          <w:numId w:val="2"/>
+        </w:numPr>
+        <w:spacing w:after="60"/>
+      </w:pPr>
+      <w:r>
+        <w:rPr>
+          <w:rFonts w:ascii="Arial" w:cs="Arial" w:eastAsia="Arial" w:hAnsi="Arial"/>
+          <w:sz w:val="22"/>
+          <w:szCs w:val="22"/>
+        </w:rPr>
+        <w:t xml:space="preserve">Tabbed interface (Playlists | Search) below the Now Playing section</w:t>
       </w:r>
     </w:p>
     <w:p>
@@ -4502,7 +4538,7 @@
         </w:rPr>
         <w:t xml:space="preserve">Folder URL: </w:t>
       </w:r>
-      <w:hyperlink w:history="1" r:id="rIdk8vlovpiee7wzh5i2hdi6">
+      <w:hyperlink w:history="1" r:id="rIdvl9uegznsbtvnlsqzxmfv">
         <w:r>
           <w:rPr>
             <w:rFonts w:ascii="Arial" w:cs="Arial" w:eastAsia="Arial" w:hAnsi="Arial"/>
@@ -8367,7 +8403,7 @@
                 <w:sz w:val="22"/>
                 <w:szCs w:val="22"/>
               </w:rPr>
-              <w:t xml:space="preserve">Left panel. Playlist selector, now-playing card, transport controls, Up Next queue with play counts and explicit badges.</w:t>
+              <w:t xml:space="preserve">Left panel. Tabbed interface (Playlists | Search). Playlist selector, now-playing card, transport controls, Up Next queue with play counts and explicit badges. Search tab with Spotify catalog search, Queue and Play Now buttons per result.</w:t>
             </w:r>
           </w:p>
         </w:tc>
@@ -9297,7 +9333,7 @@
                 <w:sz w:val="22"/>
                 <w:szCs w:val="22"/>
               </w:rPr>
-              <w:t xml:space="preserve">Thin wrappers around Spotify REST API endpoints.</w:t>
+              <w:t xml:space="preserve">Thin wrappers around Spotify REST API endpoints. Includes searchTracks() for catalog search (type=track only).</w:t>
             </w:r>
           </w:p>
         </w:tc>
@@ -9743,7 +9779,7 @@
         </w:rPr>
         <w:t xml:space="preserve"> from the local machine or by pushing to the main branch on GitHub (Visigothi/nsbp-radio). Production URL: </w:t>
       </w:r>
-      <w:hyperlink w:history="1" r:id="rIdqdvgtsjoc7e8x7ebhiutt">
+      <w:hyperlink w:history="1" r:id="rId_0l6fyx9edstdqgetpk8m">
         <w:r>
           <w:rPr>
             <w:rFonts w:ascii="Arial" w:cs="Arial" w:eastAsia="Arial" w:hAnsi="Arial"/>
@@ -9989,7 +10025,43 @@
           <w:sz w:val="22"/>
           <w:szCs w:val="22"/>
         </w:rPr>
-        <w:t xml:space="preserve">v1.2.0 BETA — Settings modal (gear icon), announcement volume slider (Web Audio API), Spotify account section moved into settings, Settings modal z-index/positioning fix (portal rendering), PKCE state parameter fix for cross-origin dev flow</w:t>
+        <w:t xml:space="preserve">v1.2.0 BETA — Settings modal (gear icon), announcement volume slider (Web Audio API), Spotify account section moved into settings</w:t>
+      </w:r>
+    </w:p>
+    <w:p>
+      <w:pPr>
+        <w:pStyle w:val="ListParagraph"/>
+        <w:numPr>
+          <w:ilvl w:val="0"/>
+          <w:numId w:val="2"/>
+        </w:numPr>
+        <w:spacing w:after="60"/>
+      </w:pPr>
+      <w:r>
+        <w:rPr>
+          <w:rFonts w:ascii="Arial" w:cs="Arial" w:eastAsia="Arial" w:hAnsi="Arial"/>
+          <w:sz w:val="22"/>
+          <w:szCs w:val="22"/>
+        </w:rPr>
+        <w:t xml:space="preserve">v1.3.0 BETA — Settings modal z-index/positioning fix (portal rendering), PKCE state parameter fix for cross-origin dev flow, logo fix for Next.js 16 Turbopack</w:t>
+      </w:r>
+    </w:p>
+    <w:p>
+      <w:pPr>
+        <w:pStyle w:val="ListParagraph"/>
+        <w:numPr>
+          <w:ilvl w:val="0"/>
+          <w:numId w:val="2"/>
+        </w:numPr>
+        <w:spacing w:after="60"/>
+      </w:pPr>
+      <w:r>
+        <w:rPr>
+          <w:rFonts w:ascii="Arial" w:cs="Arial" w:eastAsia="Arial" w:hAnsi="Arial"/>
+          <w:sz w:val="22"/>
+          <w:szCs w:val="22"/>
+        </w:rPr>
+        <w:t xml:space="preserve">v1.4.0 BETA — Spotify search feature with tabbed interface (Playlists | Search), Queue and Play Now buttons on search results, queued search track display in Up Next section</w:t>
       </w:r>
     </w:p>
     <w:p>
@@ -12183,7 +12255,7 @@
           <w:sz w:val="20"/>
           <w:szCs w:val="20"/>
         </w:rPr>
-        <w:t xml:space="preserve">End of Document · NSBP Radio v1.2.0 BETA · North Shore Bike Park · 2025</w:t>
+        <w:t xml:space="preserve">End of Document · NSBP Radio v1.4.0 BETA · North Shore Bike Park · 2025</w:t>
       </w:r>
     </w:p>
     <w:sectPr>
@@ -12273,7 +12345,7 @@
         <w:sz w:val="18"/>
         <w:szCs w:val="18"/>
       </w:rPr>
-      <w:t xml:space="preserve"> — NSBP Radio v1.2.0 BETA</w:t>
+      <w:t xml:space="preserve"> — NSBP Radio v1.4.0 BETA</w:t>
     </w:r>
   </w:p>
 </w:ftr>

</xml_diff>

<commit_message>
Add deployment guidelines to AGENTS.md and technical documentation
Document rules for production deployments: never hardcode origins, pre-deploy
checklist (env vars, OAuth URIs, build test), environment variable rules
(NEXT_PUBLIC_* baked at build time, .env.local for dev only), and a full
table of production environment variables.

Co-Authored-By: Claude Opus 4.6 (1M context) <noreply@anthropic.com>
</commit_message>
<xml_diff>
--- a/NSBP-Radio-Technical-Documentation.docx
+++ b/NSBP-Radio-Technical-Documentation.docx
@@ -76,7 +76,7 @@
         <w:spacing w:after="400"/>
         <w:jc w:val="center"/>
       </w:pPr>
-      <w:hyperlink w:history="1" r:id="rIdtvgv-kk5jm-sordmxci1h">
+      <w:hyperlink w:history="1" r:id="rIdfhgia9s61aoz7-vuh5mx_">
         <w:r>
           <w:rPr>
             <w:rFonts w:ascii="Arial" w:cs="Arial" w:eastAsia="Arial" w:hAnsi="Arial"/>
@@ -4538,7 +4538,7 @@
         </w:rPr>
         <w:t xml:space="preserve">Folder URL: </w:t>
       </w:r>
-      <w:hyperlink w:history="1" r:id="rIdvl9uegznsbtvnlsqzxmfv">
+      <w:hyperlink w:history="1" r:id="rIdkp4hrpq_hnql5csrcafdo">
         <w:r>
           <w:rPr>
             <w:rFonts w:ascii="Arial" w:cs="Arial" w:eastAsia="Arial" w:hAnsi="Arial"/>
@@ -9779,7 +9779,7 @@
         </w:rPr>
         <w:t xml:space="preserve"> from the local machine or by pushing to the main branch on GitHub (Visigothi/nsbp-radio). Production URL: </w:t>
       </w:r>
-      <w:hyperlink w:history="1" r:id="rId_0l6fyx9edstdqgetpk8m">
+      <w:hyperlink w:history="1" r:id="rIdx_5sby_zohhuefubqh32d">
         <w:r>
           <w:rPr>
             <w:rFonts w:ascii="Arial" w:cs="Arial" w:eastAsia="Arial" w:hAnsi="Arial"/>
@@ -10065,6 +10065,24 @@
       </w:r>
     </w:p>
     <w:p>
+      <w:pPr>
+        <w:pStyle w:val="ListParagraph"/>
+        <w:numPr>
+          <w:ilvl w:val="0"/>
+          <w:numId w:val="2"/>
+        </w:numPr>
+        <w:spacing w:after="60"/>
+      </w:pPr>
+      <w:r>
+        <w:rPr>
+          <w:rFonts w:ascii="Arial" w:cs="Arial" w:eastAsia="Arial" w:hAnsi="Arial"/>
+          <w:sz w:val="22"/>
+          <w:szCs w:val="22"/>
+        </w:rPr>
+        <w:t xml:space="preserve">v1.4.1 BETA — Filter currently playing track from Up Next queue, fix production Spotify callback redirect</w:t>
+      </w:r>
+    </w:p>
+    <w:p>
       <w:r>
         <w:br w:type="page"/>
       </w:r>
@@ -10083,7 +10101,1123 @@
           <w:sz w:val="32"/>
           <w:szCs w:val="32"/>
         </w:rPr>
-        <w:t xml:space="preserve">14. Known Limitations &amp; Future Considerations</w:t>
+        <w:t xml:space="preserve">14. Deployment Guidelines</w:t>
+      </w:r>
+    </w:p>
+    <w:p>
+      <w:pPr>
+        <w:spacing w:after="120"/>
+      </w:pPr>
+      <w:r>
+        <w:rPr>
+          <w:rFonts w:ascii="Arial" w:cs="Arial" w:eastAsia="Arial" w:hAnsi="Arial"/>
+          <w:sz w:val="22"/>
+          <w:szCs w:val="22"/>
+        </w:rPr>
+        <w:t xml:space="preserve">These rules prevent production deployment failures caused by dev-only assumptions baked into the build.</w:t>
+      </w:r>
+    </w:p>
+    <w:p>
+      <w:pPr>
+        <w:pStyle w:val="Heading2"/>
+        <w:spacing w:after="160" w:before="280"/>
+      </w:pPr>
+      <w:r>
+        <w:rPr>
+          <w:rFonts w:ascii="Arial" w:cs="Arial" w:eastAsia="Arial" w:hAnsi="Arial"/>
+          <w:b/>
+          <w:bCs/>
+          <w:color w:val="1A1A1A"/>
+          <w:sz w:val="28"/>
+          <w:szCs w:val="28"/>
+        </w:rPr>
+        <w:t xml:space="preserve">14.1 Never Hardcode Origins</w:t>
+      </w:r>
+    </w:p>
+    <w:p>
+      <w:pPr>
+        <w:pStyle w:val="ListParagraph"/>
+        <w:numPr>
+          <w:ilvl w:val="0"/>
+          <w:numId w:val="2"/>
+        </w:numPr>
+        <w:spacing w:after="60"/>
+      </w:pPr>
+      <w:r>
+        <w:rPr>
+          <w:rFonts w:ascii="Arial" w:cs="Arial" w:eastAsia="Arial" w:hAnsi="Arial"/>
+          <w:sz w:val="22"/>
+          <w:szCs w:val="22"/>
+        </w:rPr>
+        <w:t xml:space="preserve">Never use </w:t>
+      </w:r>
+      <w:r>
+        <w:rPr>
+          <w:rFonts w:ascii="Courier New" w:cs="Courier New" w:eastAsia="Courier New" w:hAnsi="Courier New"/>
+          <w:color w:val="C05621"/>
+          <w:sz w:val="20"/>
+          <w:szCs w:val="20"/>
+        </w:rPr>
+        <w:t xml:space="preserve">localhost</w:t>
+      </w:r>
+      <w:r>
+        <w:rPr>
+          <w:rFonts w:ascii="Arial" w:cs="Arial" w:eastAsia="Arial" w:hAnsi="Arial"/>
+          <w:sz w:val="22"/>
+          <w:szCs w:val="22"/>
+        </w:rPr>
+        <w:t xml:space="preserve"> or </w:t>
+      </w:r>
+      <w:r>
+        <w:rPr>
+          <w:rFonts w:ascii="Courier New" w:cs="Courier New" w:eastAsia="Courier New" w:hAnsi="Courier New"/>
+          <w:color w:val="C05621"/>
+          <w:sz w:val="20"/>
+          <w:szCs w:val="20"/>
+        </w:rPr>
+        <w:t xml:space="preserve">127.0.0.1</w:t>
+      </w:r>
+      <w:r>
+        <w:rPr>
+          <w:rFonts w:ascii="Arial" w:cs="Arial" w:eastAsia="Arial" w:hAnsi="Arial"/>
+          <w:sz w:val="22"/>
+          <w:szCs w:val="22"/>
+        </w:rPr>
+        <w:t xml:space="preserve"> in production code paths</w:t>
+      </w:r>
+    </w:p>
+    <w:p>
+      <w:pPr>
+        <w:pStyle w:val="ListParagraph"/>
+        <w:numPr>
+          <w:ilvl w:val="0"/>
+          <w:numId w:val="2"/>
+        </w:numPr>
+        <w:spacing w:after="60"/>
+      </w:pPr>
+      <w:r>
+        <w:rPr>
+          <w:rFonts w:ascii="Arial" w:cs="Arial" w:eastAsia="Arial" w:hAnsi="Arial"/>
+          <w:sz w:val="22"/>
+          <w:szCs w:val="22"/>
+        </w:rPr>
+        <w:t xml:space="preserve">Derive URLs from </w:t>
+      </w:r>
+      <w:r>
+        <w:rPr>
+          <w:rFonts w:ascii="Courier New" w:cs="Courier New" w:eastAsia="Courier New" w:hAnsi="Courier New"/>
+          <w:color w:val="C05621"/>
+          <w:sz w:val="20"/>
+          <w:szCs w:val="20"/>
+        </w:rPr>
+        <w:t xml:space="preserve">window.location.origin</w:t>
+      </w:r>
+      <w:r>
+        <w:rPr>
+          <w:rFonts w:ascii="Arial" w:cs="Arial" w:eastAsia="Arial" w:hAnsi="Arial"/>
+          <w:sz w:val="22"/>
+          <w:szCs w:val="22"/>
+        </w:rPr>
+        <w:t xml:space="preserve">, environment variables, or </w:t>
+      </w:r>
+      <w:r>
+        <w:rPr>
+          <w:rFonts w:ascii="Courier New" w:cs="Courier New" w:eastAsia="Courier New" w:hAnsi="Courier New"/>
+          <w:color w:val="C05621"/>
+          <w:sz w:val="20"/>
+          <w:szCs w:val="20"/>
+        </w:rPr>
+        <w:t xml:space="preserve">NEXTAUTH_URL</w:t>
+      </w:r>
+    </w:p>
+    <w:p>
+      <w:pPr>
+        <w:pStyle w:val="ListParagraph"/>
+        <w:numPr>
+          <w:ilvl w:val="0"/>
+          <w:numId w:val="2"/>
+        </w:numPr>
+        <w:spacing w:after="60"/>
+      </w:pPr>
+      <w:r>
+        <w:rPr>
+          <w:rFonts w:ascii="Arial" w:cs="Arial" w:eastAsia="Arial" w:hAnsi="Arial"/>
+          <w:sz w:val="22"/>
+          <w:szCs w:val="22"/>
+        </w:rPr>
+        <w:t xml:space="preserve">Use environment detection (</w:t>
+      </w:r>
+      <w:r>
+        <w:rPr>
+          <w:rFonts w:ascii="Courier New" w:cs="Courier New" w:eastAsia="Courier New" w:hAnsi="Courier New"/>
+          <w:color w:val="C05621"/>
+          <w:sz w:val="20"/>
+          <w:szCs w:val="20"/>
+        </w:rPr>
+        <w:t xml:space="preserve">window.location.hostname === "127.0.0.1"</w:t>
+      </w:r>
+      <w:r>
+        <w:rPr>
+          <w:rFonts w:ascii="Arial" w:cs="Arial" w:eastAsia="Arial" w:hAnsi="Arial"/>
+          <w:sz w:val="22"/>
+          <w:szCs w:val="22"/>
+        </w:rPr>
+        <w:t xml:space="preserve">) to branch dev vs production behaviour</w:t>
+      </w:r>
+    </w:p>
+    <w:p>
+      <w:pPr>
+        <w:pStyle w:val="Heading2"/>
+        <w:spacing w:after="160" w:before="280"/>
+      </w:pPr>
+      <w:r>
+        <w:rPr>
+          <w:rFonts w:ascii="Arial" w:cs="Arial" w:eastAsia="Arial" w:hAnsi="Arial"/>
+          <w:b/>
+          <w:bCs/>
+          <w:color w:val="1A1A1A"/>
+          <w:sz w:val="28"/>
+          <w:szCs w:val="28"/>
+        </w:rPr>
+        <w:t xml:space="preserve">14.2 Pre-Deploy Checklist</w:t>
+      </w:r>
+    </w:p>
+    <w:p>
+      <w:pPr>
+        <w:spacing w:after="120"/>
+      </w:pPr>
+      <w:r>
+        <w:rPr>
+          <w:rFonts w:ascii="Arial" w:cs="Arial" w:eastAsia="Arial" w:hAnsi="Arial"/>
+          <w:b/>
+          <w:bCs/>
+          <w:sz w:val="22"/>
+          <w:szCs w:val="22"/>
+        </w:rPr>
+        <w:t xml:space="preserve">Before running </w:t>
+      </w:r>
+      <w:r>
+        <w:rPr>
+          <w:rFonts w:ascii="Courier New" w:cs="Courier New" w:eastAsia="Courier New" w:hAnsi="Courier New"/>
+          <w:color w:val="C05621"/>
+          <w:sz w:val="20"/>
+          <w:szCs w:val="20"/>
+        </w:rPr>
+        <w:t xml:space="preserve">vercel --prod</w:t>
+      </w:r>
+      <w:r>
+        <w:rPr>
+          <w:rFonts w:ascii="Arial" w:cs="Arial" w:eastAsia="Arial" w:hAnsi="Arial"/>
+          <w:b/>
+          <w:bCs/>
+          <w:sz w:val="22"/>
+          <w:szCs w:val="22"/>
+        </w:rPr>
+        <w:t xml:space="preserve">:</w:t>
+      </w:r>
+    </w:p>
+    <w:p>
+      <w:pPr>
+        <w:pStyle w:val="ListParagraph"/>
+        <w:numPr>
+          <w:ilvl w:val="0"/>
+          <w:numId w:val="2"/>
+        </w:numPr>
+        <w:spacing w:after="60"/>
+      </w:pPr>
+      <w:r>
+        <w:rPr>
+          <w:rFonts w:ascii="Arial" w:cs="Arial" w:eastAsia="Arial" w:hAnsi="Arial"/>
+          <w:sz w:val="22"/>
+          <w:szCs w:val="22"/>
+        </w:rPr>
+        <w:t xml:space="preserve">Verify all new NEXT_PUBLIC_* env vars exist in the Vercel dashboard (Settings → Environment Variables)</w:t>
+      </w:r>
+    </w:p>
+    <w:p>
+      <w:pPr>
+        <w:pStyle w:val="ListParagraph"/>
+        <w:numPr>
+          <w:ilvl w:val="0"/>
+          <w:numId w:val="2"/>
+        </w:numPr>
+        <w:spacing w:after="60"/>
+      </w:pPr>
+      <w:r>
+        <w:rPr>
+          <w:rFonts w:ascii="Arial" w:cs="Arial" w:eastAsia="Arial" w:hAnsi="Arial"/>
+          <w:sz w:val="22"/>
+          <w:szCs w:val="22"/>
+        </w:rPr>
+        <w:t xml:space="preserve">Verify no localhost or 127.0.0.1 strings exist in production code paths</w:t>
+      </w:r>
+    </w:p>
+    <w:p>
+      <w:pPr>
+        <w:pStyle w:val="ListParagraph"/>
+        <w:numPr>
+          <w:ilvl w:val="0"/>
+          <w:numId w:val="2"/>
+        </w:numPr>
+        <w:spacing w:after="60"/>
+      </w:pPr>
+      <w:r>
+        <w:rPr>
+          <w:rFonts w:ascii="Arial" w:cs="Arial" w:eastAsia="Arial" w:hAnsi="Arial"/>
+          <w:sz w:val="22"/>
+          <w:szCs w:val="22"/>
+        </w:rPr>
+        <w:t xml:space="preserve">Verify any new OAuth redirect URIs are registered in the relevant dashboard (Google Cloud Console, Spotify Developer Dashboard)</w:t>
+      </w:r>
+    </w:p>
+    <w:p>
+      <w:pPr>
+        <w:pStyle w:val="ListParagraph"/>
+        <w:numPr>
+          <w:ilvl w:val="0"/>
+          <w:numId w:val="2"/>
+        </w:numPr>
+        <w:spacing w:after="60"/>
+      </w:pPr>
+      <w:r>
+        <w:rPr>
+          <w:rFonts w:ascii="Arial" w:cs="Arial" w:eastAsia="Arial" w:hAnsi="Arial"/>
+          <w:sz w:val="22"/>
+          <w:szCs w:val="22"/>
+        </w:rPr>
+        <w:t xml:space="preserve">Test the build locally with </w:t>
+      </w:r>
+      <w:r>
+        <w:rPr>
+          <w:rFonts w:ascii="Courier New" w:cs="Courier New" w:eastAsia="Courier New" w:hAnsi="Courier New"/>
+          <w:color w:val="C05621"/>
+          <w:sz w:val="20"/>
+          <w:szCs w:val="20"/>
+        </w:rPr>
+        <w:t xml:space="preserve">npx next build</w:t>
+      </w:r>
+      <w:r>
+        <w:rPr>
+          <w:rFonts w:ascii="Arial" w:cs="Arial" w:eastAsia="Arial" w:hAnsi="Arial"/>
+          <w:sz w:val="22"/>
+          <w:szCs w:val="22"/>
+        </w:rPr>
+        <w:t xml:space="preserve"> before deploying</w:t>
+      </w:r>
+    </w:p>
+    <w:p>
+      <w:pPr>
+        <w:pStyle w:val="Heading2"/>
+        <w:spacing w:after="160" w:before="280"/>
+      </w:pPr>
+      <w:r>
+        <w:rPr>
+          <w:rFonts w:ascii="Arial" w:cs="Arial" w:eastAsia="Arial" w:hAnsi="Arial"/>
+          <w:b/>
+          <w:bCs/>
+          <w:color w:val="1A1A1A"/>
+          <w:sz w:val="28"/>
+          <w:szCs w:val="28"/>
+        </w:rPr>
+        <w:t xml:space="preserve">14.3 Environment Variable Rules</w:t>
+      </w:r>
+    </w:p>
+    <w:p>
+      <w:pPr>
+        <w:pStyle w:val="ListParagraph"/>
+        <w:numPr>
+          <w:ilvl w:val="0"/>
+          <w:numId w:val="2"/>
+        </w:numPr>
+        <w:spacing w:after="60"/>
+      </w:pPr>
+      <w:r>
+        <w:rPr>
+          <w:rFonts w:ascii="Courier New" w:cs="Courier New" w:eastAsia="Courier New" w:hAnsi="Courier New"/>
+          <w:color w:val="C05621"/>
+          <w:sz w:val="20"/>
+          <w:szCs w:val="20"/>
+        </w:rPr>
+        <w:t xml:space="preserve">.env.local</w:t>
+      </w:r>
+      <w:r>
+        <w:rPr>
+          <w:rFonts w:ascii="Arial" w:cs="Arial" w:eastAsia="Arial" w:hAnsi="Arial"/>
+          <w:sz w:val="22"/>
+          <w:szCs w:val="22"/>
+        </w:rPr>
+        <w:t xml:space="preserve"> is for dev-only values — it is not deployed to Vercel</w:t>
+      </w:r>
+    </w:p>
+    <w:p>
+      <w:pPr>
+        <w:pStyle w:val="ListParagraph"/>
+        <w:numPr>
+          <w:ilvl w:val="0"/>
+          <w:numId w:val="2"/>
+        </w:numPr>
+        <w:spacing w:after="60"/>
+      </w:pPr>
+      <w:r>
+        <w:rPr>
+          <w:rFonts w:ascii="Arial" w:cs="Arial" w:eastAsia="Arial" w:hAnsi="Arial"/>
+          <w:sz w:val="22"/>
+          <w:szCs w:val="22"/>
+        </w:rPr>
+        <w:t xml:space="preserve">Production env vars are set in the Vercel dashboard and override </w:t>
+      </w:r>
+      <w:r>
+        <w:rPr>
+          <w:rFonts w:ascii="Courier New" w:cs="Courier New" w:eastAsia="Courier New" w:hAnsi="Courier New"/>
+          <w:color w:val="C05621"/>
+          <w:sz w:val="20"/>
+          <w:szCs w:val="20"/>
+        </w:rPr>
+        <w:t xml:space="preserve">.env.local</w:t>
+      </w:r>
+    </w:p>
+    <w:p>
+      <w:pPr>
+        <w:pStyle w:val="ListParagraph"/>
+        <w:numPr>
+          <w:ilvl w:val="0"/>
+          <w:numId w:val="2"/>
+        </w:numPr>
+        <w:spacing w:after="60"/>
+      </w:pPr>
+      <w:r>
+        <w:rPr>
+          <w:rFonts w:ascii="Courier New" w:cs="Courier New" w:eastAsia="Courier New" w:hAnsi="Courier New"/>
+          <w:color w:val="C05621"/>
+          <w:sz w:val="20"/>
+          <w:szCs w:val="20"/>
+        </w:rPr>
+        <w:t xml:space="preserve">NEXT_PUBLIC_*</w:t>
+      </w:r>
+      <w:r>
+        <w:rPr>
+          <w:rFonts w:ascii="Arial" w:cs="Arial" w:eastAsia="Arial" w:hAnsi="Arial"/>
+          <w:sz w:val="22"/>
+          <w:szCs w:val="22"/>
+        </w:rPr>
+        <w:t xml:space="preserve"> vars are baked into the client bundle at build time — changing them in Vercel requires a redeploy</w:t>
+      </w:r>
+    </w:p>
+    <w:p>
+      <w:pPr>
+        <w:pStyle w:val="ListParagraph"/>
+        <w:numPr>
+          <w:ilvl w:val="0"/>
+          <w:numId w:val="2"/>
+        </w:numPr>
+        <w:spacing w:after="60"/>
+      </w:pPr>
+      <w:r>
+        <w:rPr>
+          <w:rFonts w:ascii="Arial" w:cs="Arial" w:eastAsia="Arial" w:hAnsi="Arial"/>
+          <w:sz w:val="22"/>
+          <w:szCs w:val="22"/>
+        </w:rPr>
+        <w:t xml:space="preserve">Non-prefixed env vars (e.g. </w:t>
+      </w:r>
+      <w:r>
+        <w:rPr>
+          <w:rFonts w:ascii="Courier New" w:cs="Courier New" w:eastAsia="Courier New" w:hAnsi="Courier New"/>
+          <w:color w:val="C05621"/>
+          <w:sz w:val="20"/>
+          <w:szCs w:val="20"/>
+        </w:rPr>
+        <w:t xml:space="preserve">AUTH_SECRET</w:t>
+      </w:r>
+      <w:r>
+        <w:rPr>
+          <w:rFonts w:ascii="Arial" w:cs="Arial" w:eastAsia="Arial" w:hAnsi="Arial"/>
+          <w:sz w:val="22"/>
+          <w:szCs w:val="22"/>
+        </w:rPr>
+        <w:t xml:space="preserve">) are server-side only and read at runtime</w:t>
+      </w:r>
+    </w:p>
+    <w:p>
+      <w:pPr>
+        <w:pStyle w:val="Heading2"/>
+        <w:spacing w:after="160" w:before="280"/>
+      </w:pPr>
+      <w:r>
+        <w:rPr>
+          <w:rFonts w:ascii="Arial" w:cs="Arial" w:eastAsia="Arial" w:hAnsi="Arial"/>
+          <w:b/>
+          <w:bCs/>
+          <w:color w:val="1A1A1A"/>
+          <w:sz w:val="28"/>
+          <w:szCs w:val="28"/>
+        </w:rPr>
+        <w:t xml:space="preserve">14.4 Production Environment Variables</w:t>
+      </w:r>
+    </w:p>
+    <w:tbl>
+      <w:tblPr>
+        <w:tblW w:type="dxa" w:w="9360"/>
+        <w:tblBorders>
+          <w:top w:val="single" w:color="auto" w:sz="4"/>
+          <w:left w:val="single" w:color="auto" w:sz="4"/>
+          <w:bottom w:val="single" w:color="auto" w:sz="4"/>
+          <w:right w:val="single" w:color="auto" w:sz="4"/>
+          <w:insideH w:val="single" w:color="auto" w:sz="4"/>
+          <w:insideV w:val="single" w:color="auto" w:sz="4"/>
+        </w:tblBorders>
+      </w:tblPr>
+      <w:tblGrid>
+        <w:gridCol w:w="4200"/>
+        <w:gridCol w:w="5160"/>
+      </w:tblGrid>
+      <w:tr>
+        <w:tc>
+          <w:tcPr>
+            <w:tcW w:type="dxa" w:w="4200"/>
+            <w:tcBorders>
+              <w:top w:val="single" w:color="D4D4D8" w:sz="1"/>
+              <w:left w:val="single" w:color="D4D4D8" w:sz="1"/>
+              <w:bottom w:val="single" w:color="D4D4D8" w:sz="1"/>
+              <w:right w:val="single" w:color="D4D4D8" w:sz="1"/>
+            </w:tcBorders>
+            <w:shd w:fill="FFF7ED" w:val="clear"/>
+            <w:tcMar>
+              <w:top w:type="dxa" w:w="60"/>
+              <w:left w:type="dxa" w:w="100"/>
+              <w:bottom w:type="dxa" w:w="60"/>
+              <w:right w:type="dxa" w:w="100"/>
+            </w:tcMar>
+          </w:tcPr>
+          <w:p>
+            <w:pPr>
+              <w:spacing w:after="40"/>
+            </w:pPr>
+            <w:r>
+              <w:rPr>
+                <w:rFonts w:ascii="Arial" w:cs="Arial" w:eastAsia="Arial" w:hAnsi="Arial"/>
+                <w:b/>
+                <w:bCs/>
+                <w:sz w:val="22"/>
+                <w:szCs w:val="22"/>
+              </w:rPr>
+              <w:t xml:space="preserve">Variable</w:t>
+            </w:r>
+          </w:p>
+        </w:tc>
+        <w:tc>
+          <w:tcPr>
+            <w:tcW w:type="dxa" w:w="5160"/>
+            <w:tcBorders>
+              <w:top w:val="single" w:color="D4D4D8" w:sz="1"/>
+              <w:left w:val="single" w:color="D4D4D8" w:sz="1"/>
+              <w:bottom w:val="single" w:color="D4D4D8" w:sz="1"/>
+              <w:right w:val="single" w:color="D4D4D8" w:sz="1"/>
+            </w:tcBorders>
+            <w:shd w:fill="FFF7ED" w:val="clear"/>
+            <w:tcMar>
+              <w:top w:type="dxa" w:w="60"/>
+              <w:left w:type="dxa" w:w="100"/>
+              <w:bottom w:type="dxa" w:w="60"/>
+              <w:right w:type="dxa" w:w="100"/>
+            </w:tcMar>
+          </w:tcPr>
+          <w:p>
+            <w:pPr>
+              <w:spacing w:after="40"/>
+            </w:pPr>
+            <w:r>
+              <w:rPr>
+                <w:rFonts w:ascii="Arial" w:cs="Arial" w:eastAsia="Arial" w:hAnsi="Arial"/>
+                <w:b/>
+                <w:bCs/>
+                <w:sz w:val="22"/>
+                <w:szCs w:val="22"/>
+              </w:rPr>
+              <w:t xml:space="preserve">Production Value</w:t>
+            </w:r>
+          </w:p>
+        </w:tc>
+      </w:tr>
+      <w:tr>
+        <w:tc>
+          <w:tcPr>
+            <w:tcW w:type="dxa" w:w="4200"/>
+            <w:tcBorders>
+              <w:top w:val="single" w:color="D4D4D8" w:sz="1"/>
+              <w:left w:val="single" w:color="D4D4D8" w:sz="1"/>
+              <w:bottom w:val="single" w:color="D4D4D8" w:sz="1"/>
+              <w:right w:val="single" w:color="D4D4D8" w:sz="1"/>
+            </w:tcBorders>
+            <w:tcMar>
+              <w:top w:type="dxa" w:w="60"/>
+              <w:left w:type="dxa" w:w="100"/>
+              <w:bottom w:type="dxa" w:w="60"/>
+              <w:right w:type="dxa" w:w="100"/>
+            </w:tcMar>
+          </w:tcPr>
+          <w:p>
+            <w:pPr>
+              <w:spacing w:after="40"/>
+            </w:pPr>
+            <w:r>
+              <w:rPr>
+                <w:rFonts w:ascii="Arial" w:cs="Arial" w:eastAsia="Arial" w:hAnsi="Arial"/>
+                <w:sz w:val="22"/>
+                <w:szCs w:val="22"/>
+              </w:rPr>
+              <w:t xml:space="preserve">AUTH_SECRET</w:t>
+            </w:r>
+          </w:p>
+        </w:tc>
+        <w:tc>
+          <w:tcPr>
+            <w:tcW w:type="dxa" w:w="5160"/>
+            <w:tcBorders>
+              <w:top w:val="single" w:color="D4D4D8" w:sz="1"/>
+              <w:left w:val="single" w:color="D4D4D8" w:sz="1"/>
+              <w:bottom w:val="single" w:color="D4D4D8" w:sz="1"/>
+              <w:right w:val="single" w:color="D4D4D8" w:sz="1"/>
+            </w:tcBorders>
+            <w:tcMar>
+              <w:top w:type="dxa" w:w="60"/>
+              <w:left w:type="dxa" w:w="100"/>
+              <w:bottom w:type="dxa" w:w="60"/>
+              <w:right w:type="dxa" w:w="100"/>
+            </w:tcMar>
+          </w:tcPr>
+          <w:p>
+            <w:pPr>
+              <w:spacing w:after="40"/>
+            </w:pPr>
+            <w:r>
+              <w:rPr>
+                <w:rFonts w:ascii="Arial" w:cs="Arial" w:eastAsia="Arial" w:hAnsi="Arial"/>
+                <w:sz w:val="22"/>
+                <w:szCs w:val="22"/>
+              </w:rPr>
+              <w:t xml:space="preserve">(secret — stored in Vercel)</w:t>
+            </w:r>
+          </w:p>
+        </w:tc>
+      </w:tr>
+      <w:tr>
+        <w:tc>
+          <w:tcPr>
+            <w:tcW w:type="dxa" w:w="4200"/>
+            <w:tcBorders>
+              <w:top w:val="single" w:color="D4D4D8" w:sz="1"/>
+              <w:left w:val="single" w:color="D4D4D8" w:sz="1"/>
+              <w:bottom w:val="single" w:color="D4D4D8" w:sz="1"/>
+              <w:right w:val="single" w:color="D4D4D8" w:sz="1"/>
+            </w:tcBorders>
+            <w:tcMar>
+              <w:top w:type="dxa" w:w="60"/>
+              <w:left w:type="dxa" w:w="100"/>
+              <w:bottom w:type="dxa" w:w="60"/>
+              <w:right w:type="dxa" w:w="100"/>
+            </w:tcMar>
+          </w:tcPr>
+          <w:p>
+            <w:pPr>
+              <w:spacing w:after="40"/>
+            </w:pPr>
+            <w:r>
+              <w:rPr>
+                <w:rFonts w:ascii="Arial" w:cs="Arial" w:eastAsia="Arial" w:hAnsi="Arial"/>
+                <w:sz w:val="22"/>
+                <w:szCs w:val="22"/>
+              </w:rPr>
+              <w:t xml:space="preserve">NEXTAUTH_URL</w:t>
+            </w:r>
+          </w:p>
+        </w:tc>
+        <w:tc>
+          <w:tcPr>
+            <w:tcW w:type="dxa" w:w="5160"/>
+            <w:tcBorders>
+              <w:top w:val="single" w:color="D4D4D8" w:sz="1"/>
+              <w:left w:val="single" w:color="D4D4D8" w:sz="1"/>
+              <w:bottom w:val="single" w:color="D4D4D8" w:sz="1"/>
+              <w:right w:val="single" w:color="D4D4D8" w:sz="1"/>
+            </w:tcBorders>
+            <w:tcMar>
+              <w:top w:type="dxa" w:w="60"/>
+              <w:left w:type="dxa" w:w="100"/>
+              <w:bottom w:type="dxa" w:w="60"/>
+              <w:right w:type="dxa" w:w="100"/>
+            </w:tcMar>
+          </w:tcPr>
+          <w:p>
+            <w:pPr>
+              <w:spacing w:after="40"/>
+            </w:pPr>
+            <w:r>
+              <w:rPr>
+                <w:rFonts w:ascii="Arial" w:cs="Arial" w:eastAsia="Arial" w:hAnsi="Arial"/>
+                <w:sz w:val="22"/>
+                <w:szCs w:val="22"/>
+              </w:rPr>
+              <w:t xml:space="preserve">https://nsbp-radio.vercel.app</w:t>
+            </w:r>
+          </w:p>
+        </w:tc>
+      </w:tr>
+      <w:tr>
+        <w:tc>
+          <w:tcPr>
+            <w:tcW w:type="dxa" w:w="4200"/>
+            <w:tcBorders>
+              <w:top w:val="single" w:color="D4D4D8" w:sz="1"/>
+              <w:left w:val="single" w:color="D4D4D8" w:sz="1"/>
+              <w:bottom w:val="single" w:color="D4D4D8" w:sz="1"/>
+              <w:right w:val="single" w:color="D4D4D8" w:sz="1"/>
+            </w:tcBorders>
+            <w:tcMar>
+              <w:top w:type="dxa" w:w="60"/>
+              <w:left w:type="dxa" w:w="100"/>
+              <w:bottom w:type="dxa" w:w="60"/>
+              <w:right w:type="dxa" w:w="100"/>
+            </w:tcMar>
+          </w:tcPr>
+          <w:p>
+            <w:pPr>
+              <w:spacing w:after="40"/>
+            </w:pPr>
+            <w:r>
+              <w:rPr>
+                <w:rFonts w:ascii="Arial" w:cs="Arial" w:eastAsia="Arial" w:hAnsi="Arial"/>
+                <w:sz w:val="22"/>
+                <w:szCs w:val="22"/>
+              </w:rPr>
+              <w:t xml:space="preserve">GOOGLE_CLIENT_ID</w:t>
+            </w:r>
+          </w:p>
+        </w:tc>
+        <w:tc>
+          <w:tcPr>
+            <w:tcW w:type="dxa" w:w="5160"/>
+            <w:tcBorders>
+              <w:top w:val="single" w:color="D4D4D8" w:sz="1"/>
+              <w:left w:val="single" w:color="D4D4D8" w:sz="1"/>
+              <w:bottom w:val="single" w:color="D4D4D8" w:sz="1"/>
+              <w:right w:val="single" w:color="D4D4D8" w:sz="1"/>
+            </w:tcBorders>
+            <w:tcMar>
+              <w:top w:type="dxa" w:w="60"/>
+              <w:left w:type="dxa" w:w="100"/>
+              <w:bottom w:type="dxa" w:w="60"/>
+              <w:right w:type="dxa" w:w="100"/>
+            </w:tcMar>
+          </w:tcPr>
+          <w:p>
+            <w:pPr>
+              <w:spacing w:after="40"/>
+            </w:pPr>
+            <w:r>
+              <w:rPr>
+                <w:rFonts w:ascii="Arial" w:cs="Arial" w:eastAsia="Arial" w:hAnsi="Arial"/>
+                <w:sz w:val="22"/>
+                <w:szCs w:val="22"/>
+              </w:rPr>
+              <w:t xml:space="preserve">(from Google Cloud Console)</w:t>
+            </w:r>
+          </w:p>
+        </w:tc>
+      </w:tr>
+      <w:tr>
+        <w:tc>
+          <w:tcPr>
+            <w:tcW w:type="dxa" w:w="4200"/>
+            <w:tcBorders>
+              <w:top w:val="single" w:color="D4D4D8" w:sz="1"/>
+              <w:left w:val="single" w:color="D4D4D8" w:sz="1"/>
+              <w:bottom w:val="single" w:color="D4D4D8" w:sz="1"/>
+              <w:right w:val="single" w:color="D4D4D8" w:sz="1"/>
+            </w:tcBorders>
+            <w:tcMar>
+              <w:top w:type="dxa" w:w="60"/>
+              <w:left w:type="dxa" w:w="100"/>
+              <w:bottom w:type="dxa" w:w="60"/>
+              <w:right w:type="dxa" w:w="100"/>
+            </w:tcMar>
+          </w:tcPr>
+          <w:p>
+            <w:pPr>
+              <w:spacing w:after="40"/>
+            </w:pPr>
+            <w:r>
+              <w:rPr>
+                <w:rFonts w:ascii="Arial" w:cs="Arial" w:eastAsia="Arial" w:hAnsi="Arial"/>
+                <w:sz w:val="22"/>
+                <w:szCs w:val="22"/>
+              </w:rPr>
+              <w:t xml:space="preserve">GOOGLE_CLIENT_SECRET</w:t>
+            </w:r>
+          </w:p>
+        </w:tc>
+        <w:tc>
+          <w:tcPr>
+            <w:tcW w:type="dxa" w:w="5160"/>
+            <w:tcBorders>
+              <w:top w:val="single" w:color="D4D4D8" w:sz="1"/>
+              <w:left w:val="single" w:color="D4D4D8" w:sz="1"/>
+              <w:bottom w:val="single" w:color="D4D4D8" w:sz="1"/>
+              <w:right w:val="single" w:color="D4D4D8" w:sz="1"/>
+            </w:tcBorders>
+            <w:tcMar>
+              <w:top w:type="dxa" w:w="60"/>
+              <w:left w:type="dxa" w:w="100"/>
+              <w:bottom w:type="dxa" w:w="60"/>
+              <w:right w:type="dxa" w:w="100"/>
+            </w:tcMar>
+          </w:tcPr>
+          <w:p>
+            <w:pPr>
+              <w:spacing w:after="40"/>
+            </w:pPr>
+            <w:r>
+              <w:rPr>
+                <w:rFonts w:ascii="Arial" w:cs="Arial" w:eastAsia="Arial" w:hAnsi="Arial"/>
+                <w:sz w:val="22"/>
+                <w:szCs w:val="22"/>
+              </w:rPr>
+              <w:t xml:space="preserve">(secret — stored in Vercel)</w:t>
+            </w:r>
+          </w:p>
+        </w:tc>
+      </w:tr>
+      <w:tr>
+        <w:tc>
+          <w:tcPr>
+            <w:tcW w:type="dxa" w:w="4200"/>
+            <w:tcBorders>
+              <w:top w:val="single" w:color="D4D4D8" w:sz="1"/>
+              <w:left w:val="single" w:color="D4D4D8" w:sz="1"/>
+              <w:bottom w:val="single" w:color="D4D4D8" w:sz="1"/>
+              <w:right w:val="single" w:color="D4D4D8" w:sz="1"/>
+            </w:tcBorders>
+            <w:tcMar>
+              <w:top w:type="dxa" w:w="60"/>
+              <w:left w:type="dxa" w:w="100"/>
+              <w:bottom w:type="dxa" w:w="60"/>
+              <w:right w:type="dxa" w:w="100"/>
+            </w:tcMar>
+          </w:tcPr>
+          <w:p>
+            <w:pPr>
+              <w:spacing w:after="40"/>
+            </w:pPr>
+            <w:r>
+              <w:rPr>
+                <w:rFonts w:ascii="Arial" w:cs="Arial" w:eastAsia="Arial" w:hAnsi="Arial"/>
+                <w:sz w:val="22"/>
+                <w:szCs w:val="22"/>
+              </w:rPr>
+              <w:t xml:space="preserve">ALLOWED_EMAILS</w:t>
+            </w:r>
+          </w:p>
+        </w:tc>
+        <w:tc>
+          <w:tcPr>
+            <w:tcW w:type="dxa" w:w="5160"/>
+            <w:tcBorders>
+              <w:top w:val="single" w:color="D4D4D8" w:sz="1"/>
+              <w:left w:val="single" w:color="D4D4D8" w:sz="1"/>
+              <w:bottom w:val="single" w:color="D4D4D8" w:sz="1"/>
+              <w:right w:val="single" w:color="D4D4D8" w:sz="1"/>
+            </w:tcBorders>
+            <w:tcMar>
+              <w:top w:type="dxa" w:w="60"/>
+              <w:left w:type="dxa" w:w="100"/>
+              <w:bottom w:type="dxa" w:w="60"/>
+              <w:right w:type="dxa" w:w="100"/>
+            </w:tcMar>
+          </w:tcPr>
+          <w:p>
+            <w:pPr>
+              <w:spacing w:after="40"/>
+            </w:pPr>
+            <w:r>
+              <w:rPr>
+                <w:rFonts w:ascii="Arial" w:cs="Arial" w:eastAsia="Arial" w:hAnsi="Arial"/>
+                <w:sz w:val="22"/>
+                <w:szCs w:val="22"/>
+              </w:rPr>
+              <w:t xml:space="preserve">(comma-separated staff emails)</w:t>
+            </w:r>
+          </w:p>
+        </w:tc>
+      </w:tr>
+      <w:tr>
+        <w:tc>
+          <w:tcPr>
+            <w:tcW w:type="dxa" w:w="4200"/>
+            <w:tcBorders>
+              <w:top w:val="single" w:color="D4D4D8" w:sz="1"/>
+              <w:left w:val="single" w:color="D4D4D8" w:sz="1"/>
+              <w:bottom w:val="single" w:color="D4D4D8" w:sz="1"/>
+              <w:right w:val="single" w:color="D4D4D8" w:sz="1"/>
+            </w:tcBorders>
+            <w:tcMar>
+              <w:top w:type="dxa" w:w="60"/>
+              <w:left w:type="dxa" w:w="100"/>
+              <w:bottom w:type="dxa" w:w="60"/>
+              <w:right w:type="dxa" w:w="100"/>
+            </w:tcMar>
+          </w:tcPr>
+          <w:p>
+            <w:pPr>
+              <w:spacing w:after="40"/>
+            </w:pPr>
+            <w:r>
+              <w:rPr>
+                <w:rFonts w:ascii="Arial" w:cs="Arial" w:eastAsia="Arial" w:hAnsi="Arial"/>
+                <w:sz w:val="22"/>
+                <w:szCs w:val="22"/>
+              </w:rPr>
+              <w:t xml:space="preserve">NEXT_PUBLIC_SPOTIFY_CLIENT_ID</w:t>
+            </w:r>
+          </w:p>
+        </w:tc>
+        <w:tc>
+          <w:tcPr>
+            <w:tcW w:type="dxa" w:w="5160"/>
+            <w:tcBorders>
+              <w:top w:val="single" w:color="D4D4D8" w:sz="1"/>
+              <w:left w:val="single" w:color="D4D4D8" w:sz="1"/>
+              <w:bottom w:val="single" w:color="D4D4D8" w:sz="1"/>
+              <w:right w:val="single" w:color="D4D4D8" w:sz="1"/>
+            </w:tcBorders>
+            <w:tcMar>
+              <w:top w:type="dxa" w:w="60"/>
+              <w:left w:type="dxa" w:w="100"/>
+              <w:bottom w:type="dxa" w:w="60"/>
+              <w:right w:type="dxa" w:w="100"/>
+            </w:tcMar>
+          </w:tcPr>
+          <w:p>
+            <w:pPr>
+              <w:spacing w:after="40"/>
+            </w:pPr>
+            <w:r>
+              <w:rPr>
+                <w:rFonts w:ascii="Arial" w:cs="Arial" w:eastAsia="Arial" w:hAnsi="Arial"/>
+                <w:sz w:val="22"/>
+                <w:szCs w:val="22"/>
+              </w:rPr>
+              <w:t xml:space="preserve">(from Spotify Developer Dashboard)</w:t>
+            </w:r>
+          </w:p>
+        </w:tc>
+      </w:tr>
+      <w:tr>
+        <w:tc>
+          <w:tcPr>
+            <w:tcW w:type="dxa" w:w="4200"/>
+            <w:tcBorders>
+              <w:top w:val="single" w:color="D4D4D8" w:sz="1"/>
+              <w:left w:val="single" w:color="D4D4D8" w:sz="1"/>
+              <w:bottom w:val="single" w:color="D4D4D8" w:sz="1"/>
+              <w:right w:val="single" w:color="D4D4D8" w:sz="1"/>
+            </w:tcBorders>
+            <w:tcMar>
+              <w:top w:type="dxa" w:w="60"/>
+              <w:left w:type="dxa" w:w="100"/>
+              <w:bottom w:type="dxa" w:w="60"/>
+              <w:right w:type="dxa" w:w="100"/>
+            </w:tcMar>
+          </w:tcPr>
+          <w:p>
+            <w:pPr>
+              <w:spacing w:after="40"/>
+            </w:pPr>
+            <w:r>
+              <w:rPr>
+                <w:rFonts w:ascii="Arial" w:cs="Arial" w:eastAsia="Arial" w:hAnsi="Arial"/>
+                <w:sz w:val="22"/>
+                <w:szCs w:val="22"/>
+              </w:rPr>
+              <w:t xml:space="preserve">NEXT_PUBLIC_SPOTIFY_REDIRECT_URI</w:t>
+            </w:r>
+          </w:p>
+        </w:tc>
+        <w:tc>
+          <w:tcPr>
+            <w:tcW w:type="dxa" w:w="5160"/>
+            <w:tcBorders>
+              <w:top w:val="single" w:color="D4D4D8" w:sz="1"/>
+              <w:left w:val="single" w:color="D4D4D8" w:sz="1"/>
+              <w:bottom w:val="single" w:color="D4D4D8" w:sz="1"/>
+              <w:right w:val="single" w:color="D4D4D8" w:sz="1"/>
+            </w:tcBorders>
+            <w:tcMar>
+              <w:top w:type="dxa" w:w="60"/>
+              <w:left w:type="dxa" w:w="100"/>
+              <w:bottom w:type="dxa" w:w="60"/>
+              <w:right w:type="dxa" w:w="100"/>
+            </w:tcMar>
+          </w:tcPr>
+          <w:p>
+            <w:pPr>
+              <w:spacing w:after="40"/>
+            </w:pPr>
+            <w:r>
+              <w:rPr>
+                <w:rFonts w:ascii="Arial" w:cs="Arial" w:eastAsia="Arial" w:hAnsi="Arial"/>
+                <w:sz w:val="22"/>
+                <w:szCs w:val="22"/>
+              </w:rPr>
+              <w:t xml:space="preserve">https://nsbp-radio.vercel.app/spotify-callback</w:t>
+            </w:r>
+          </w:p>
+        </w:tc>
+      </w:tr>
+      <w:tr>
+        <w:tc>
+          <w:tcPr>
+            <w:tcW w:type="dxa" w:w="4200"/>
+            <w:tcBorders>
+              <w:top w:val="single" w:color="D4D4D8" w:sz="1"/>
+              <w:left w:val="single" w:color="D4D4D8" w:sz="1"/>
+              <w:bottom w:val="single" w:color="D4D4D8" w:sz="1"/>
+              <w:right w:val="single" w:color="D4D4D8" w:sz="1"/>
+            </w:tcBorders>
+            <w:tcMar>
+              <w:top w:type="dxa" w:w="60"/>
+              <w:left w:type="dxa" w:w="100"/>
+              <w:bottom w:type="dxa" w:w="60"/>
+              <w:right w:type="dxa" w:w="100"/>
+            </w:tcMar>
+          </w:tcPr>
+          <w:p>
+            <w:pPr>
+              <w:spacing w:after="40"/>
+            </w:pPr>
+            <w:r>
+              <w:rPr>
+                <w:rFonts w:ascii="Arial" w:cs="Arial" w:eastAsia="Arial" w:hAnsi="Arial"/>
+                <w:sz w:val="22"/>
+                <w:szCs w:val="22"/>
+              </w:rPr>
+              <w:t xml:space="preserve">NEXT_PUBLIC_GOOGLE_API_KEY</w:t>
+            </w:r>
+          </w:p>
+        </w:tc>
+        <w:tc>
+          <w:tcPr>
+            <w:tcW w:type="dxa" w:w="5160"/>
+            <w:tcBorders>
+              <w:top w:val="single" w:color="D4D4D8" w:sz="1"/>
+              <w:left w:val="single" w:color="D4D4D8" w:sz="1"/>
+              <w:bottom w:val="single" w:color="D4D4D8" w:sz="1"/>
+              <w:right w:val="single" w:color="D4D4D8" w:sz="1"/>
+            </w:tcBorders>
+            <w:tcMar>
+              <w:top w:type="dxa" w:w="60"/>
+              <w:left w:type="dxa" w:w="100"/>
+              <w:bottom w:type="dxa" w:w="60"/>
+              <w:right w:type="dxa" w:w="100"/>
+            </w:tcMar>
+          </w:tcPr>
+          <w:p>
+            <w:pPr>
+              <w:spacing w:after="40"/>
+            </w:pPr>
+            <w:r>
+              <w:rPr>
+                <w:rFonts w:ascii="Arial" w:cs="Arial" w:eastAsia="Arial" w:hAnsi="Arial"/>
+                <w:sz w:val="22"/>
+                <w:szCs w:val="22"/>
+              </w:rPr>
+              <w:t xml:space="preserve">(from Google Cloud Console)</w:t>
+            </w:r>
+          </w:p>
+        </w:tc>
+      </w:tr>
+      <w:tr>
+        <w:tc>
+          <w:tcPr>
+            <w:tcW w:type="dxa" w:w="4200"/>
+            <w:tcBorders>
+              <w:top w:val="single" w:color="D4D4D8" w:sz="1"/>
+              <w:left w:val="single" w:color="D4D4D8" w:sz="1"/>
+              <w:bottom w:val="single" w:color="D4D4D8" w:sz="1"/>
+              <w:right w:val="single" w:color="D4D4D8" w:sz="1"/>
+            </w:tcBorders>
+            <w:tcMar>
+              <w:top w:type="dxa" w:w="60"/>
+              <w:left w:type="dxa" w:w="100"/>
+              <w:bottom w:type="dxa" w:w="60"/>
+              <w:right w:type="dxa" w:w="100"/>
+            </w:tcMar>
+          </w:tcPr>
+          <w:p>
+            <w:pPr>
+              <w:spacing w:after="40"/>
+            </w:pPr>
+            <w:r>
+              <w:rPr>
+                <w:rFonts w:ascii="Arial" w:cs="Arial" w:eastAsia="Arial" w:hAnsi="Arial"/>
+                <w:sz w:val="22"/>
+                <w:szCs w:val="22"/>
+              </w:rPr>
+              <w:t xml:space="preserve">NEXT_PUBLIC_DEFAULT_DRIVE_FOLDER_ID</w:t>
+            </w:r>
+          </w:p>
+        </w:tc>
+        <w:tc>
+          <w:tcPr>
+            <w:tcW w:type="dxa" w:w="5160"/>
+            <w:tcBorders>
+              <w:top w:val="single" w:color="D4D4D8" w:sz="1"/>
+              <w:left w:val="single" w:color="D4D4D8" w:sz="1"/>
+              <w:bottom w:val="single" w:color="D4D4D8" w:sz="1"/>
+              <w:right w:val="single" w:color="D4D4D8" w:sz="1"/>
+            </w:tcBorders>
+            <w:tcMar>
+              <w:top w:type="dxa" w:w="60"/>
+              <w:left w:type="dxa" w:w="100"/>
+              <w:bottom w:type="dxa" w:w="60"/>
+              <w:right w:type="dxa" w:w="100"/>
+            </w:tcMar>
+          </w:tcPr>
+          <w:p>
+            <w:pPr>
+              <w:spacing w:after="40"/>
+            </w:pPr>
+            <w:r>
+              <w:rPr>
+                <w:rFonts w:ascii="Arial" w:cs="Arial" w:eastAsia="Arial" w:hAnsi="Arial"/>
+                <w:sz w:val="22"/>
+                <w:szCs w:val="22"/>
+              </w:rPr>
+              <w:t xml:space="preserve">(Google Drive folder ID)</w:t>
+            </w:r>
+          </w:p>
+        </w:tc>
+      </w:tr>
+    </w:tbl>
+    <w:p>
+      <w:r>
+        <w:br w:type="page"/>
+      </w:r>
+    </w:p>
+    <w:p>
+      <w:pPr>
+        <w:pStyle w:val="Heading1"/>
+        <w:spacing w:after="200" w:before="360"/>
+      </w:pPr>
+      <w:r>
+        <w:rPr>
+          <w:rFonts w:ascii="Arial" w:cs="Arial" w:eastAsia="Arial" w:hAnsi="Arial"/>
+          <w:b/>
+          <w:bCs/>
+          <w:color w:val="FF9D1A"/>
+          <w:sz w:val="32"/>
+          <w:szCs w:val="32"/>
+        </w:rPr>
+        <w:t xml:space="preserve">15. Known Limitations &amp; Future Considerations</w:t>
       </w:r>
     </w:p>
     <w:tbl>
@@ -10681,7 +11815,7 @@
           <w:sz w:val="28"/>
           <w:szCs w:val="28"/>
         </w:rPr>
-        <w:t xml:space="preserve">14.1 Potential Enhancements</w:t>
+        <w:t xml:space="preserve">15.1 Potential Enhancements</w:t>
       </w:r>
     </w:p>
     <w:p>
@@ -10811,7 +11945,7 @@
           <w:sz w:val="32"/>
           <w:szCs w:val="32"/>
         </w:rPr>
-        <w:t xml:space="preserve">15. Quick Reference</w:t>
+        <w:t xml:space="preserve">16. Quick Reference</w:t>
       </w:r>
     </w:p>
     <w:p>
@@ -10828,7 +11962,7 @@
           <w:sz w:val="28"/>
           <w:szCs w:val="28"/>
         </w:rPr>
-        <w:t xml:space="preserve">15.1 Key URLs</w:t>
+        <w:t xml:space="preserve">16.1 Key URLs</w:t>
       </w:r>
     </w:p>
     <w:tbl>
@@ -11364,7 +12498,7 @@
           <w:sz w:val="28"/>
           <w:szCs w:val="28"/>
         </w:rPr>
-        <w:t xml:space="preserve">15.2 Authorised Staff Emails</w:t>
+        <w:t xml:space="preserve">16.2 Authorised Staff Emails</w:t>
       </w:r>
     </w:p>
     <w:p>
@@ -11471,7 +12605,7 @@
           <w:sz w:val="28"/>
           <w:szCs w:val="28"/>
         </w:rPr>
-        <w:t xml:space="preserve">15.3 Brand Colours</w:t>
+        <w:t xml:space="preserve">16.3 Brand Colours</w:t>
       </w:r>
     </w:p>
     <w:tbl>

</xml_diff>